<commit_message>
updated some helper files
</commit_message>
<xml_diff>
--- a/Zung Jung Web App v0.2 Spec Part 1.docx
+++ b/Zung Jung Web App v0.2 Spec Part 1.docx
@@ -93,103 +93,79 @@
           <w:rFonts w:ascii="Calibri" w:eastAsia="PMingLiU" w:hAnsi="Calibri" w:cs="Calibri"/>
           <w:lang w:eastAsia="zh-TW"/>
         </w:rPr>
-        <w:t xml:space="preserve">The hand contains one meld including a 1 (so 123, 111, or 1111), one meld including a 9 (so 789, 999, or 9999), </w:t>
-      </w:r>
+        <w:t>The hand contains one meld including a 1 (so 123, 111, or 1111), one meld including a 9 (so 789, 999, or 9999), and one meld of number tiles not including 1 or 9 (so the same melds that qualify for No Terminals). The last meld can be a triplet/Kong of wind tiles, in which case the pair must not be wind tiles or a number tile already represented by a sequence meld in the hand (so all dragon tiles are always OK, as are all number tiles if the hand is All Triplets), OR the last meld can be a triplet/Kong of dragon tiles, in which case the pair must either be the player’s Seat Wind (see definition in pattern 3.1), OR a number tile NOT already represented by a sequence meld in the hand.</w:t>
+      </w:r>
+    </w:p>
+    <w:p>
+      <w:pPr>
+        <w:pStyle w:val="ListParagraph"/>
+        <w:numPr>
+          <w:ilvl w:val="2"/>
+          <w:numId w:val="1"/>
+        </w:numPr>
+        <w:rPr>
+          <w:rFonts w:ascii="Calibri" w:hAnsi="Calibri" w:cs="Calibri"/>
+        </w:rPr>
+      </w:pPr>
       <w:r>
         <w:rPr>
           <w:rFonts w:ascii="Calibri" w:eastAsia="PMingLiU" w:hAnsi="Calibri" w:cs="Calibri"/>
           <w:lang w:eastAsia="zh-TW"/>
         </w:rPr>
-        <w:t xml:space="preserve">and </w:t>
+        <w:t xml:space="preserve">In other words, this is a strictly looser definition than the previous definition, since dragon triplets are now allowed, only with </w:t>
       </w:r>
       <w:r>
         <w:rPr>
           <w:rFonts w:ascii="Calibri" w:eastAsia="PMingLiU" w:hAnsi="Calibri" w:cs="Calibri"/>
           <w:lang w:eastAsia="zh-TW"/>
         </w:rPr>
-        <w:t>one meld of number tiles not including 1 or 9 (so the same melds that qualify for No Terminals)</w:t>
+        <w:t>differing</w:t>
       </w:r>
       <w:r>
         <w:rPr>
           <w:rFonts w:ascii="Calibri" w:eastAsia="PMingLiU" w:hAnsi="Calibri" w:cs="Calibri"/>
           <w:lang w:eastAsia="zh-TW"/>
         </w:rPr>
-        <w:t xml:space="preserve">. The last meld can be a triplet/Kong of wind tiles, in which case the </w:t>
-      </w:r>
-      <w:r>
+        <w:t xml:space="preserve"> restrictions on the pair</w:t>
+      </w:r>
+    </w:p>
+    <w:p>
+      <w:pPr>
+        <w:pStyle w:val="ListParagraph"/>
+        <w:numPr>
+          <w:ilvl w:val="0"/>
+          <w:numId w:val="1"/>
+        </w:numPr>
         <w:rPr>
           <w:rFonts w:ascii="Calibri" w:eastAsia="PMingLiU" w:hAnsi="Calibri" w:cs="Calibri"/>
           <w:lang w:eastAsia="zh-TW"/>
         </w:rPr>
-        <w:t>pair must not be wind tiles or a number tile already represented by a sequence meld in the hand (so all dragon tiles are always OK, as are all number tiles if the hand is All Triplets)</w:t>
-      </w:r>
-      <w:r>
+      </w:pPr>
+      <w:r>
+        <w:rPr>
+          <w:rFonts w:ascii="Calibri" w:hAnsi="Calibri" w:cs="Calibri"/>
+        </w:rPr>
+        <w:t>Going to the home page should automatically exit you out of any room you are currently in awaiting a game, as under current behavior, it doesn’t and the player stays in the room</w:t>
+      </w:r>
+    </w:p>
+    <w:p>
+      <w:pPr>
+        <w:pStyle w:val="ListParagraph"/>
+        <w:numPr>
+          <w:ilvl w:val="0"/>
+          <w:numId w:val="1"/>
+        </w:numPr>
         <w:rPr>
           <w:rFonts w:ascii="Calibri" w:eastAsia="PMingLiU" w:hAnsi="Calibri" w:cs="Calibri"/>
           <w:lang w:eastAsia="zh-TW"/>
         </w:rPr>
-        <w:t xml:space="preserve">, OR the last meld can be a triplet/Kong of dragon tiles, in which case the pair must either be the player’s Seat Wind (see definition in pattern 3.1), OR </w:t>
-      </w:r>
+      </w:pPr>
       <w:r>
         <w:rPr>
           <w:rFonts w:ascii="Calibri" w:eastAsia="PMingLiU" w:hAnsi="Calibri" w:cs="Calibri"/>
           <w:lang w:eastAsia="zh-TW"/>
         </w:rPr>
-        <w:t xml:space="preserve">a number tile </w:t>
-      </w:r>
-      <w:r>
-        <w:rPr>
-          <w:rFonts w:ascii="Calibri" w:eastAsia="PMingLiU" w:hAnsi="Calibri" w:cs="Calibri"/>
-          <w:lang w:eastAsia="zh-TW"/>
-        </w:rPr>
-        <w:t xml:space="preserve">NOT </w:t>
-      </w:r>
-      <w:r>
-        <w:rPr>
-          <w:rFonts w:ascii="Calibri" w:eastAsia="PMingLiU" w:hAnsi="Calibri" w:cs="Calibri"/>
-          <w:lang w:eastAsia="zh-TW"/>
-        </w:rPr>
-        <w:t>already represented by a sequence meld in the hand</w:t>
-      </w:r>
-      <w:r>
-        <w:rPr>
-          <w:rFonts w:ascii="Calibri" w:eastAsia="PMingLiU" w:hAnsi="Calibri" w:cs="Calibri"/>
-          <w:lang w:eastAsia="zh-TW"/>
-        </w:rPr>
-        <w:t>.</w:t>
-      </w:r>
-    </w:p>
-    <w:p>
-      <w:pPr>
-        <w:pStyle w:val="ListParagraph"/>
-        <w:numPr>
-          <w:ilvl w:val="2"/>
-          <w:numId w:val="1"/>
-        </w:numPr>
-        <w:rPr>
-          <w:rFonts w:ascii="Calibri" w:hAnsi="Calibri" w:cs="Calibri"/>
-        </w:rPr>
-      </w:pPr>
-      <w:r>
-        <w:rPr>
-          <w:rFonts w:ascii="Calibri" w:eastAsia="PMingLiU" w:hAnsi="Calibri" w:cs="Calibri"/>
-          <w:lang w:eastAsia="zh-TW"/>
-        </w:rPr>
-        <w:t xml:space="preserve">In other words, this is a strictly looser definition than the previous definition, since dragon triplets are now allowed, only with </w:t>
-      </w:r>
-      <w:r>
-        <w:rPr>
-          <w:rFonts w:ascii="Calibri" w:eastAsia="PMingLiU" w:hAnsi="Calibri" w:cs="Calibri"/>
-          <w:lang w:eastAsia="zh-TW"/>
-        </w:rPr>
-        <w:t>differing</w:t>
-      </w:r>
-      <w:r>
-        <w:rPr>
-          <w:rFonts w:ascii="Calibri" w:eastAsia="PMingLiU" w:hAnsi="Calibri" w:cs="Calibri"/>
-          <w:lang w:eastAsia="zh-TW"/>
-        </w:rPr>
-        <w:t xml:space="preserve"> restrictions on the pair</w:t>
+        <w:t>When an opponent on the left or right makes many Kongs, their username and tiles can go off the screen. To prevent this, when the left opponent makes a Concealed Kong or Big Exposed Kong, their tiles can be shifted downwards slightly, and when the right opponent makes a Concealed Kong or Big Exposed Kong, their tiles can be shifted upwards slightly to compensate and not go off the screen</w:t>
       </w:r>
     </w:p>
     <w:p>
@@ -200,15 +176,50 @@
           <w:numId w:val="1"/>
         </w:numPr>
         <w:rPr>
-          <w:rFonts w:ascii="Calibri" w:eastAsia="PMingLiU" w:hAnsi="Calibri" w:cs="Calibri"/>
-          <w:lang w:eastAsia="zh-TW"/>
-        </w:rPr>
-      </w:pPr>
-      <w:r>
-        <w:rPr>
-          <w:rFonts w:ascii="Calibri" w:hAnsi="Calibri" w:cs="Calibri"/>
-        </w:rPr>
-        <w:t>Going to the home page should automatically exit you out of any room you are currently in awaiting a game, as under current behavior, it doesn’t and the player stays in the room</w:t>
+          <w:rFonts w:ascii="Calibri" w:hAnsi="Calibri" w:cs="Calibri"/>
+        </w:rPr>
+      </w:pPr>
+      <w:r>
+        <w:rPr>
+          <w:rFonts w:ascii="Calibri" w:hAnsi="Calibri" w:cs="Calibri"/>
+        </w:rPr>
+        <w:t>Small changes to Chicken bot policy</w:t>
+      </w:r>
+    </w:p>
+    <w:p>
+      <w:pPr>
+        <w:pStyle w:val="ListParagraph"/>
+        <w:numPr>
+          <w:ilvl w:val="1"/>
+          <w:numId w:val="1"/>
+        </w:numPr>
+        <w:rPr>
+          <w:rFonts w:ascii="Calibri" w:hAnsi="Calibri" w:cs="Calibri"/>
+        </w:rPr>
+      </w:pPr>
+      <w:r>
+        <w:rPr>
+          <w:rFonts w:ascii="Calibri" w:hAnsi="Calibri" w:cs="Calibri"/>
+        </w:rPr>
+        <w:t>Chicken bot priority for if it can Chow multiple ways with the same distance from ready and distance reducing outs, is currently to make the highest Chow. Instead, change it to the following priority, from highest priority to lowest: Chow 456, Chow 345, Chow 567, Chow 234, Chow 678, Chow 123, Chow 789</w:t>
+      </w:r>
+    </w:p>
+    <w:p>
+      <w:pPr>
+        <w:pStyle w:val="ListParagraph"/>
+        <w:numPr>
+          <w:ilvl w:val="1"/>
+          <w:numId w:val="1"/>
+        </w:numPr>
+        <w:rPr>
+          <w:rFonts w:ascii="Calibri" w:hAnsi="Calibri" w:cs="Calibri"/>
+        </w:rPr>
+      </w:pPr>
+      <w:r>
+        <w:rPr>
+          <w:rFonts w:ascii="Calibri" w:hAnsi="Calibri" w:cs="Calibri"/>
+        </w:rPr>
+        <w:t>Also, discard order when going for Thirteen Terminals should be changed back to the same discard order as when going for Seven Pairs, except that the specific tiles B1, C1, D1, B9, C9, D9 are moved to the end of the priority list (so a Chicken bot going for Thirteen Terminals will never discard a D9, unless it has 3 or more copies of it and all other tiles are unique 1s/9s/Honors)</w:t>
       </w:r>
     </w:p>
     <w:p>
@@ -219,16 +230,14 @@
           <w:numId w:val="1"/>
         </w:numPr>
         <w:rPr>
-          <w:rFonts w:ascii="Calibri" w:eastAsia="PMingLiU" w:hAnsi="Calibri" w:cs="Calibri"/>
-          <w:lang w:eastAsia="zh-TW"/>
-        </w:rPr>
-      </w:pPr>
-      <w:r>
-        <w:rPr>
-          <w:rFonts w:ascii="Calibri" w:eastAsia="PMingLiU" w:hAnsi="Calibri" w:cs="Calibri"/>
-          <w:lang w:eastAsia="zh-TW"/>
-        </w:rPr>
-        <w:t>When an opponent on the left or right makes many Kongs, their username and tiles can go off the screen. To prevent this, when the left opponent makes a Concealed Kong or Big Exposed Kong, their tiles can be shifted downwards slightly, and when the right opponent makes a Concealed Kong or Big Exposed Kong, their tiles can be shifted upwards slightly to compensate and not go off the screen</w:t>
+          <w:rFonts w:ascii="Calibri" w:hAnsi="Calibri" w:cs="Calibri"/>
+        </w:rPr>
+      </w:pPr>
+      <w:r>
+        <w:rPr>
+          <w:rFonts w:ascii="Calibri" w:hAnsi="Calibri" w:cs="Calibri"/>
+        </w:rPr>
+        <w:t>When running low on time, make the flashing transition a smooth transition between the yellow and red instead of blinking</w:t>
       </w:r>
     </w:p>
     <w:p>
@@ -246,78 +255,6 @@
         <w:rPr>
           <w:rFonts w:ascii="Calibri" w:hAnsi="Calibri" w:cs="Calibri"/>
         </w:rPr>
-        <w:t>Small changes to Chicken bot policy</w:t>
-      </w:r>
-    </w:p>
-    <w:p>
-      <w:pPr>
-        <w:pStyle w:val="ListParagraph"/>
-        <w:numPr>
-          <w:ilvl w:val="1"/>
-          <w:numId w:val="1"/>
-        </w:numPr>
-        <w:rPr>
-          <w:rFonts w:ascii="Calibri" w:hAnsi="Calibri" w:cs="Calibri"/>
-        </w:rPr>
-      </w:pPr>
-      <w:r>
-        <w:rPr>
-          <w:rFonts w:ascii="Calibri" w:hAnsi="Calibri" w:cs="Calibri"/>
-        </w:rPr>
-        <w:t>Chicken bot priority for if it can Chow multiple ways with the same distance from ready and distance reducing outs, is currently to make the highest Chow. Instead, change it to the following priority, from highest priority to lowest: Chow 456, Chow 345, Chow 567, Chow 234, Chow 678, Chow 123, Chow 789</w:t>
-      </w:r>
-    </w:p>
-    <w:p>
-      <w:pPr>
-        <w:pStyle w:val="ListParagraph"/>
-        <w:numPr>
-          <w:ilvl w:val="1"/>
-          <w:numId w:val="1"/>
-        </w:numPr>
-        <w:rPr>
-          <w:rFonts w:ascii="Calibri" w:hAnsi="Calibri" w:cs="Calibri"/>
-        </w:rPr>
-      </w:pPr>
-      <w:r>
-        <w:rPr>
-          <w:rFonts w:ascii="Calibri" w:hAnsi="Calibri" w:cs="Calibri"/>
-        </w:rPr>
-        <w:t>Also, discard order when going for Thirteen Terminals should be changed back to the same discard order as when going for Seven Pairs, except that the specific tiles B1, C1, D1, B9, C9, D9 are moved to the end of the priority list (so a Chicken bot going for Thirteen Terminals will never discard a D9, unless it has 3 or more copies of it and all other tiles are unique 1s/9s/Honors)</w:t>
-      </w:r>
-    </w:p>
-    <w:p>
-      <w:pPr>
-        <w:pStyle w:val="ListParagraph"/>
-        <w:numPr>
-          <w:ilvl w:val="0"/>
-          <w:numId w:val="1"/>
-        </w:numPr>
-        <w:rPr>
-          <w:rFonts w:ascii="Calibri" w:hAnsi="Calibri" w:cs="Calibri"/>
-        </w:rPr>
-      </w:pPr>
-      <w:r>
-        <w:rPr>
-          <w:rFonts w:ascii="Calibri" w:hAnsi="Calibri" w:cs="Calibri"/>
-        </w:rPr>
-        <w:t>When running low on time, make the flashing transition a smooth transition between the yellow and red instead of blinking</w:t>
-      </w:r>
-    </w:p>
-    <w:p>
-      <w:pPr>
-        <w:pStyle w:val="ListParagraph"/>
-        <w:numPr>
-          <w:ilvl w:val="0"/>
-          <w:numId w:val="1"/>
-        </w:numPr>
-        <w:rPr>
-          <w:rFonts w:ascii="Calibri" w:hAnsi="Calibri" w:cs="Calibri"/>
-        </w:rPr>
-      </w:pPr>
-      <w:r>
-        <w:rPr>
-          <w:rFonts w:ascii="Calibri" w:hAnsi="Calibri" w:cs="Calibri"/>
-        </w:rPr>
         <w:t>When during the initial setup phase of the dice roll being visible, clicking the circle inside the central control panel should immediately switch to the “E1 70” informational view, and a second click to “</w:t>
       </w:r>
       <w:r>
@@ -330,31 +267,7 @@
         <w:rPr>
           <w:rFonts w:ascii="Calibri" w:hAnsi="Calibri" w:cs="Calibri"/>
         </w:rPr>
-        <w:t xml:space="preserve"> </w:t>
-      </w:r>
-      <w:r>
-        <w:rPr>
-          <w:rFonts w:ascii="Calibri" w:hAnsi="Calibri" w:cs="Calibri"/>
-        </w:rPr>
-        <w:t>70</w:t>
-      </w:r>
-      <w:r>
-        <w:rPr>
-          <w:rFonts w:ascii="Calibri" w:hAnsi="Calibri" w:cs="Calibri"/>
-        </w:rPr>
-        <w:t xml:space="preserve">”, and a third click back to </w:t>
-      </w:r>
-      <w:r>
-        <w:rPr>
-          <w:rFonts w:ascii="Calibri" w:hAnsi="Calibri" w:cs="Calibri"/>
-        </w:rPr>
-        <w:t>“E1 70”</w:t>
-      </w:r>
-      <w:r>
-        <w:rPr>
-          <w:rFonts w:ascii="Calibri" w:hAnsi="Calibri" w:cs="Calibri"/>
-        </w:rPr>
-        <w:t>, never going back to the dice roll</w:t>
+        <w:t xml:space="preserve"> 70”, and a third click back to “E1 70”, never going back to the dice roll</w:t>
       </w:r>
     </w:p>
     <w:p>
@@ -518,13 +431,7 @@
         <w:rPr>
           <w:rFonts w:ascii="Calibri" w:hAnsi="Calibri" w:cs="Calibri"/>
         </w:rPr>
-        <w:t xml:space="preserve">Letting the clock run down with no input for three </w:t>
-      </w:r>
-      <w:r>
-        <w:rPr>
-          <w:rFonts w:ascii="Calibri" w:hAnsi="Calibri" w:cs="Calibri"/>
-        </w:rPr>
-        <w:t>post-discard phases from opponents, all consecutive</w:t>
+        <w:t>Letting the clock run down with no input for three post-discard phases from opponents, all consecutive</w:t>
       </w:r>
     </w:p>
     <w:p>
@@ -664,14 +571,14 @@
         <w:rPr>
           <w:rFonts w:ascii="Calibri" w:hAnsi="Calibri" w:cs="Calibri"/>
         </w:rPr>
-        <w:t xml:space="preserve">Achievements Page: Achievements are for registered users only. For now, include only a single achievement, “Breaking the Wall”. The condition of this achievement is to play a match of any length to the end, but all four players must be registered humans with no guests and bots, and no player can leave the match early. Note that if a player is on </w:t>
+        <w:t xml:space="preserve">Achievements Page: Achievements are for registered users only. For now, include only a single achievement, “Breaking the Wall”. The condition of this achievement is to play a match of any length to the end, but all four players must be registered humans with no </w:t>
       </w:r>
       <w:r>
         <w:rPr>
           <w:rFonts w:ascii="Calibri" w:hAnsi="Calibri" w:cs="Calibri"/>
         </w:rPr>
         <w:lastRenderedPageBreak/>
-        <w:t xml:space="preserve">system set Auto Mode </w:t>
+        <w:t xml:space="preserve">guests and bots, and no player can leave the match early. Note that if a player is on system set Auto Mode </w:t>
       </w:r>
       <w:r>
         <w:rPr>
@@ -930,14 +837,7 @@
         <w:rPr>
           <w:rFonts w:ascii="Calibri" w:hAnsi="Calibri" w:cs="Calibri"/>
         </w:rPr>
-        <w:t xml:space="preserve">Tournament matches cannot start until all four seats are occupied by registered user players. Bots cannot play in tournament matches. When four seats are occupied, instead of the “host” starting the match, the system will start the match in 10 seconds, unless </w:t>
-      </w:r>
-      <w:r>
-        <w:rPr>
-          <w:rFonts w:ascii="Calibri" w:hAnsi="Calibri" w:cs="Calibri"/>
-        </w:rPr>
-        <w:lastRenderedPageBreak/>
-        <w:t>someone leaves during that time window. Alert the users in and outside the room to this with a countdown of the same color as the “IN GAME” text</w:t>
+        <w:t>Tournament matches cannot start until all four seats are occupied by registered user players. Bots cannot play in tournament matches. When four seats are occupied, instead of the “host” starting the match, the system will start the match in 10 seconds, unless someone leaves during that time window. Alert the users in and outside the room to this with a countdown of the same color as the “IN GAME” text</w:t>
       </w:r>
     </w:p>
     <w:p>
@@ -955,6 +855,7 @@
         <w:rPr>
           <w:rFonts w:ascii="Calibri" w:hAnsi="Calibri" w:cs="Calibri"/>
         </w:rPr>
+        <w:lastRenderedPageBreak/>
         <w:t>Tournament matches are set to the default settings, same settings as Room #0. They are the same as regular matches, except once finished, all players are awarded Rank Points based on how well they scored. Display the players’ Rank Points on the final scoring screen. Rank Points are equal to the player’s final score plus 500. However, a player scoring below -450 is guaranteed a minimum of 50 Rank Points, as an incentive to not quit the match when having a very negative score</w:t>
       </w:r>
     </w:p>
@@ -991,43 +892,7 @@
         <w:rPr>
           <w:rFonts w:ascii="Calibri" w:hAnsi="Calibri" w:cs="Calibri"/>
         </w:rPr>
-        <w:t xml:space="preserve">A player leaving a tournament match early, in addition to receiving 0 Rank Points instead of the +50 had they stayed until the end, is further penalized by being barred from playing in next week’s weekly tournament. Note that again, </w:t>
-      </w:r>
-      <w:r>
-        <w:rPr>
-          <w:rFonts w:ascii="Calibri" w:hAnsi="Calibri" w:cs="Calibri"/>
-        </w:rPr>
-        <w:t xml:space="preserve">if a player is on system set Auto Mode </w:t>
-      </w:r>
-      <w:r>
-        <w:rPr>
-          <w:rFonts w:ascii="Calibri" w:hAnsi="Calibri" w:cs="Calibri"/>
-        </w:rPr>
-        <w:t>at</w:t>
-      </w:r>
-      <w:r>
-        <w:rPr>
-          <w:rFonts w:ascii="Calibri" w:hAnsi="Calibri" w:cs="Calibri"/>
-        </w:rPr>
-        <w:t xml:space="preserve"> the </w:t>
-      </w:r>
-      <w:r>
-        <w:rPr>
-          <w:rFonts w:ascii="Calibri" w:hAnsi="Calibri" w:cs="Calibri"/>
-        </w:rPr>
-        <w:t>moment</w:t>
-      </w:r>
-      <w:r>
-        <w:rPr>
-          <w:rFonts w:ascii="Calibri" w:hAnsi="Calibri" w:cs="Calibri"/>
-        </w:rPr>
-        <w:t xml:space="preserve"> the match ends, that also counts as leaving the match</w:t>
-      </w:r>
-      <w:r>
-        <w:rPr>
-          <w:rFonts w:ascii="Calibri" w:hAnsi="Calibri" w:cs="Calibri"/>
-        </w:rPr>
-        <w:t>. An error message should notify the player if next week they try to join a weekly tournament match room</w:t>
+        <w:t>A player leaving a tournament match early, in addition to receiving 0 Rank Points instead of the +50 had they stayed until the end, is further penalized by being barred from playing in next week’s weekly tournament. Note that again, if a player is on system set Auto Mode at the moment the match ends, that also counts as leaving the match. An error message should notify the player if next week they try to join a weekly tournament match room</w:t>
       </w:r>
     </w:p>
     <w:p>
@@ -1148,179 +1013,179 @@
   </w:abstractNum>
   <w:abstractNum w:abstractNumId="1" w15:restartNumberingAfterBreak="0">
     <w:nsid w:val="3BBB31F6"/>
-    <w:multiLevelType w:val="hybridMultilevel"/>
-    <w:tmpl w:val="F514C3B4"/>
-    <w:lvl w:ilvl="0" w:tplc="0409000F">
+    <w:multiLevelType w:val="multilevel"/>
+    <w:tmpl w:val="0409001F"/>
+    <w:lvl w:ilvl="0">
       <w:start w:val="1"/>
       <w:numFmt w:val="decimal"/>
       <w:lvlText w:val="%1."/>
       <w:lvlJc w:val="left"/>
       <w:pPr>
-        <w:ind w:left="720" w:hanging="360"/>
+        <w:ind w:left="360" w:hanging="360"/>
       </w:pPr>
       <w:rPr>
         <w:rFonts w:hint="default"/>
       </w:rPr>
     </w:lvl>
-    <w:lvl w:ilvl="1" w:tplc="04090019">
-      <w:start w:val="1"/>
-      <w:numFmt w:val="lowerLetter"/>
-      <w:lvlText w:val="%2."/>
-      <w:lvlJc w:val="left"/>
-      <w:pPr>
-        <w:ind w:left="1440" w:hanging="360"/>
-      </w:pPr>
-    </w:lvl>
-    <w:lvl w:ilvl="2" w:tplc="0409001B" w:tentative="1">
-      <w:start w:val="1"/>
-      <w:numFmt w:val="lowerRoman"/>
-      <w:lvlText w:val="%3."/>
-      <w:lvlJc w:val="right"/>
-      <w:pPr>
-        <w:ind w:left="2160" w:hanging="180"/>
-      </w:pPr>
-    </w:lvl>
-    <w:lvl w:ilvl="3" w:tplc="0409000F" w:tentative="1">
-      <w:start w:val="1"/>
-      <w:numFmt w:val="decimal"/>
-      <w:lvlText w:val="%4."/>
-      <w:lvlJc w:val="left"/>
-      <w:pPr>
-        <w:ind w:left="2880" w:hanging="360"/>
-      </w:pPr>
-    </w:lvl>
-    <w:lvl w:ilvl="4" w:tplc="04090019" w:tentative="1">
-      <w:start w:val="1"/>
-      <w:numFmt w:val="lowerLetter"/>
-      <w:lvlText w:val="%5."/>
-      <w:lvlJc w:val="left"/>
-      <w:pPr>
-        <w:ind w:left="3600" w:hanging="360"/>
-      </w:pPr>
-    </w:lvl>
-    <w:lvl w:ilvl="5" w:tplc="0409001B" w:tentative="1">
-      <w:start w:val="1"/>
-      <w:numFmt w:val="lowerRoman"/>
-      <w:lvlText w:val="%6."/>
-      <w:lvlJc w:val="right"/>
-      <w:pPr>
-        <w:ind w:left="4320" w:hanging="180"/>
-      </w:pPr>
-    </w:lvl>
-    <w:lvl w:ilvl="6" w:tplc="0409000F" w:tentative="1">
-      <w:start w:val="1"/>
-      <w:numFmt w:val="decimal"/>
-      <w:lvlText w:val="%7."/>
-      <w:lvlJc w:val="left"/>
-      <w:pPr>
-        <w:ind w:left="5040" w:hanging="360"/>
-      </w:pPr>
-    </w:lvl>
-    <w:lvl w:ilvl="7" w:tplc="04090019" w:tentative="1">
-      <w:start w:val="1"/>
-      <w:numFmt w:val="lowerLetter"/>
-      <w:lvlText w:val="%8."/>
-      <w:lvlJc w:val="left"/>
-      <w:pPr>
-        <w:ind w:left="5760" w:hanging="360"/>
-      </w:pPr>
-    </w:lvl>
-    <w:lvl w:ilvl="8" w:tplc="0409001B" w:tentative="1">
-      <w:start w:val="1"/>
-      <w:numFmt w:val="lowerRoman"/>
-      <w:lvlText w:val="%9."/>
-      <w:lvlJc w:val="right"/>
-      <w:pPr>
-        <w:ind w:left="6480" w:hanging="180"/>
+    <w:lvl w:ilvl="1">
+      <w:start w:val="1"/>
+      <w:numFmt w:val="decimal"/>
+      <w:lvlText w:val="%1.%2."/>
+      <w:lvlJc w:val="left"/>
+      <w:pPr>
+        <w:ind w:left="792" w:hanging="432"/>
+      </w:pPr>
+    </w:lvl>
+    <w:lvl w:ilvl="2">
+      <w:start w:val="1"/>
+      <w:numFmt w:val="decimal"/>
+      <w:lvlText w:val="%1.%2.%3."/>
+      <w:lvlJc w:val="left"/>
+      <w:pPr>
+        <w:ind w:left="1224" w:hanging="504"/>
+      </w:pPr>
+    </w:lvl>
+    <w:lvl w:ilvl="3">
+      <w:start w:val="1"/>
+      <w:numFmt w:val="decimal"/>
+      <w:lvlText w:val="%1.%2.%3.%4."/>
+      <w:lvlJc w:val="left"/>
+      <w:pPr>
+        <w:ind w:left="1728" w:hanging="648"/>
+      </w:pPr>
+    </w:lvl>
+    <w:lvl w:ilvl="4">
+      <w:start w:val="1"/>
+      <w:numFmt w:val="decimal"/>
+      <w:lvlText w:val="%1.%2.%3.%4.%5."/>
+      <w:lvlJc w:val="left"/>
+      <w:pPr>
+        <w:ind w:left="2232" w:hanging="792"/>
+      </w:pPr>
+    </w:lvl>
+    <w:lvl w:ilvl="5">
+      <w:start w:val="1"/>
+      <w:numFmt w:val="decimal"/>
+      <w:lvlText w:val="%1.%2.%3.%4.%5.%6."/>
+      <w:lvlJc w:val="left"/>
+      <w:pPr>
+        <w:ind w:left="2736" w:hanging="936"/>
+      </w:pPr>
+    </w:lvl>
+    <w:lvl w:ilvl="6">
+      <w:start w:val="1"/>
+      <w:numFmt w:val="decimal"/>
+      <w:lvlText w:val="%1.%2.%3.%4.%5.%6.%7."/>
+      <w:lvlJc w:val="left"/>
+      <w:pPr>
+        <w:ind w:left="3240" w:hanging="1080"/>
+      </w:pPr>
+    </w:lvl>
+    <w:lvl w:ilvl="7">
+      <w:start w:val="1"/>
+      <w:numFmt w:val="decimal"/>
+      <w:lvlText w:val="%1.%2.%3.%4.%5.%6.%7.%8."/>
+      <w:lvlJc w:val="left"/>
+      <w:pPr>
+        <w:ind w:left="3744" w:hanging="1224"/>
+      </w:pPr>
+    </w:lvl>
+    <w:lvl w:ilvl="8">
+      <w:start w:val="1"/>
+      <w:numFmt w:val="decimal"/>
+      <w:lvlText w:val="%1.%2.%3.%4.%5.%6.%7.%8.%9."/>
+      <w:lvlJc w:val="left"/>
+      <w:pPr>
+        <w:ind w:left="4320" w:hanging="1440"/>
       </w:pPr>
     </w:lvl>
   </w:abstractNum>
   <w:abstractNum w:abstractNumId="2" w15:restartNumberingAfterBreak="0">
     <w:nsid w:val="5489623B"/>
-    <w:multiLevelType w:val="hybridMultilevel"/>
-    <w:tmpl w:val="06449BA2"/>
-    <w:lvl w:ilvl="0" w:tplc="0409000F">
+    <w:multiLevelType w:val="multilevel"/>
+    <w:tmpl w:val="0409001F"/>
+    <w:lvl w:ilvl="0">
       <w:start w:val="1"/>
       <w:numFmt w:val="decimal"/>
       <w:lvlText w:val="%1."/>
       <w:lvlJc w:val="left"/>
       <w:pPr>
-        <w:ind w:left="720" w:hanging="360"/>
+        <w:ind w:left="360" w:hanging="360"/>
       </w:pPr>
       <w:rPr>
         <w:rFonts w:hint="default"/>
       </w:rPr>
     </w:lvl>
-    <w:lvl w:ilvl="1" w:tplc="04090019">
-      <w:start w:val="1"/>
-      <w:numFmt w:val="lowerLetter"/>
-      <w:lvlText w:val="%2."/>
-      <w:lvlJc w:val="left"/>
-      <w:pPr>
-        <w:ind w:left="1440" w:hanging="360"/>
-      </w:pPr>
-    </w:lvl>
-    <w:lvl w:ilvl="2" w:tplc="0409001B" w:tentative="1">
-      <w:start w:val="1"/>
-      <w:numFmt w:val="lowerRoman"/>
-      <w:lvlText w:val="%3."/>
-      <w:lvlJc w:val="right"/>
-      <w:pPr>
-        <w:ind w:left="2160" w:hanging="180"/>
-      </w:pPr>
-    </w:lvl>
-    <w:lvl w:ilvl="3" w:tplc="0409000F" w:tentative="1">
-      <w:start w:val="1"/>
-      <w:numFmt w:val="decimal"/>
-      <w:lvlText w:val="%4."/>
-      <w:lvlJc w:val="left"/>
-      <w:pPr>
-        <w:ind w:left="2880" w:hanging="360"/>
-      </w:pPr>
-    </w:lvl>
-    <w:lvl w:ilvl="4" w:tplc="04090019" w:tentative="1">
-      <w:start w:val="1"/>
-      <w:numFmt w:val="lowerLetter"/>
-      <w:lvlText w:val="%5."/>
-      <w:lvlJc w:val="left"/>
-      <w:pPr>
-        <w:ind w:left="3600" w:hanging="360"/>
-      </w:pPr>
-    </w:lvl>
-    <w:lvl w:ilvl="5" w:tplc="0409001B" w:tentative="1">
-      <w:start w:val="1"/>
-      <w:numFmt w:val="lowerRoman"/>
-      <w:lvlText w:val="%6."/>
-      <w:lvlJc w:val="right"/>
-      <w:pPr>
-        <w:ind w:left="4320" w:hanging="180"/>
-      </w:pPr>
-    </w:lvl>
-    <w:lvl w:ilvl="6" w:tplc="0409000F" w:tentative="1">
-      <w:start w:val="1"/>
-      <w:numFmt w:val="decimal"/>
-      <w:lvlText w:val="%7."/>
-      <w:lvlJc w:val="left"/>
-      <w:pPr>
-        <w:ind w:left="5040" w:hanging="360"/>
-      </w:pPr>
-    </w:lvl>
-    <w:lvl w:ilvl="7" w:tplc="04090019" w:tentative="1">
-      <w:start w:val="1"/>
-      <w:numFmt w:val="lowerLetter"/>
-      <w:lvlText w:val="%8."/>
-      <w:lvlJc w:val="left"/>
-      <w:pPr>
-        <w:ind w:left="5760" w:hanging="360"/>
-      </w:pPr>
-    </w:lvl>
-    <w:lvl w:ilvl="8" w:tplc="0409001B" w:tentative="1">
-      <w:start w:val="1"/>
-      <w:numFmt w:val="lowerRoman"/>
-      <w:lvlText w:val="%9."/>
-      <w:lvlJc w:val="right"/>
-      <w:pPr>
-        <w:ind w:left="6480" w:hanging="180"/>
+    <w:lvl w:ilvl="1">
+      <w:start w:val="1"/>
+      <w:numFmt w:val="decimal"/>
+      <w:lvlText w:val="%1.%2."/>
+      <w:lvlJc w:val="left"/>
+      <w:pPr>
+        <w:ind w:left="792" w:hanging="432"/>
+      </w:pPr>
+    </w:lvl>
+    <w:lvl w:ilvl="2">
+      <w:start w:val="1"/>
+      <w:numFmt w:val="decimal"/>
+      <w:lvlText w:val="%1.%2.%3."/>
+      <w:lvlJc w:val="left"/>
+      <w:pPr>
+        <w:ind w:left="1224" w:hanging="504"/>
+      </w:pPr>
+    </w:lvl>
+    <w:lvl w:ilvl="3">
+      <w:start w:val="1"/>
+      <w:numFmt w:val="decimal"/>
+      <w:lvlText w:val="%1.%2.%3.%4."/>
+      <w:lvlJc w:val="left"/>
+      <w:pPr>
+        <w:ind w:left="1728" w:hanging="648"/>
+      </w:pPr>
+    </w:lvl>
+    <w:lvl w:ilvl="4">
+      <w:start w:val="1"/>
+      <w:numFmt w:val="decimal"/>
+      <w:lvlText w:val="%1.%2.%3.%4.%5."/>
+      <w:lvlJc w:val="left"/>
+      <w:pPr>
+        <w:ind w:left="2232" w:hanging="792"/>
+      </w:pPr>
+    </w:lvl>
+    <w:lvl w:ilvl="5">
+      <w:start w:val="1"/>
+      <w:numFmt w:val="decimal"/>
+      <w:lvlText w:val="%1.%2.%3.%4.%5.%6."/>
+      <w:lvlJc w:val="left"/>
+      <w:pPr>
+        <w:ind w:left="2736" w:hanging="936"/>
+      </w:pPr>
+    </w:lvl>
+    <w:lvl w:ilvl="6">
+      <w:start w:val="1"/>
+      <w:numFmt w:val="decimal"/>
+      <w:lvlText w:val="%1.%2.%3.%4.%5.%6.%7."/>
+      <w:lvlJc w:val="left"/>
+      <w:pPr>
+        <w:ind w:left="3240" w:hanging="1080"/>
+      </w:pPr>
+    </w:lvl>
+    <w:lvl w:ilvl="7">
+      <w:start w:val="1"/>
+      <w:numFmt w:val="decimal"/>
+      <w:lvlText w:val="%1.%2.%3.%4.%5.%6.%7.%8."/>
+      <w:lvlJc w:val="left"/>
+      <w:pPr>
+        <w:ind w:left="3744" w:hanging="1224"/>
+      </w:pPr>
+    </w:lvl>
+    <w:lvl w:ilvl="8">
+      <w:start w:val="1"/>
+      <w:numFmt w:val="decimal"/>
+      <w:lvlText w:val="%1.%2.%3.%4.%5.%6.%7.%8.%9."/>
+      <w:lvlJc w:val="left"/>
+      <w:pPr>
+        <w:ind w:left="4320" w:hanging="1440"/>
       </w:pPr>
     </w:lvl>
   </w:abstractNum>

</xml_diff>